<commit_message>
Carta intestata ufficiale (luglio 2026) applicata a tutti i template; lo script di build la applica sempre
Co-Authored-By: Claude Fable 5.1 <noreply@anthropic.com>
Claude-Session: https://claude.ai/code/session_01EgzFUhSvaWJs38ShbsWomW
</commit_message>
<xml_diff>
--- a/server/src/templates/contratto_dipendente.docx
+++ b/server/src/templates/contratto_dipendente.docx
@@ -2667,54 +2667,54 @@
       <w:pStyle w:val="Pidipagina"/>
       <w:jc w:val="right"/>
       <w:rPr>
-        <w:rFonts w:ascii="Arial" w:hAnsi="Arial" w:cs="Arial"/>
+        <w:rFonts w:cs="Arial"/>
         <w:color w:val="1B505F"/>
-        <w:sz w:val="16"/>
-        <w:szCs w:val="16"/>
+        <w:sz w:val="18"/>
+        <w:szCs w:val="18"/>
       </w:rPr>
     </w:pPr>
     <w:r>
       <w:rPr>
-        <w:rFonts w:ascii="Arial" w:hAnsi="Arial" w:cs="Arial"/>
+        <w:rFonts w:cs="Arial"/>
         <w:color w:val="1B505F"/>
-        <w:sz w:val="16"/>
-        <w:szCs w:val="16"/>
+        <w:sz w:val="18"/>
+        <w:szCs w:val="18"/>
       </w:rPr>
       <w:fldChar w:fldCharType="begin"/>
     </w:r>
     <w:r>
       <w:rPr>
-        <w:rFonts w:ascii="Arial" w:hAnsi="Arial" w:cs="Arial"/>
+        <w:rFonts w:cs="Arial"/>
         <w:color w:val="1B505F"/>
-        <w:sz w:val="16"/>
-        <w:szCs w:val="16"/>
+        <w:sz w:val="18"/>
+        <w:szCs w:val="18"/>
       </w:rPr>
       <w:instrText>PAGE   \* MERGEFORMAT</w:instrText>
     </w:r>
     <w:r>
       <w:rPr>
-        <w:rFonts w:ascii="Arial" w:hAnsi="Arial" w:cs="Arial"/>
+        <w:rFonts w:cs="Arial"/>
         <w:color w:val="1B505F"/>
-        <w:sz w:val="16"/>
-        <w:szCs w:val="16"/>
+        <w:sz w:val="18"/>
+        <w:szCs w:val="18"/>
       </w:rPr>
       <w:fldChar w:fldCharType="separate"/>
     </w:r>
     <w:r>
       <w:rPr>
-        <w:rFonts w:ascii="Arial" w:hAnsi="Arial" w:cs="Arial"/>
+        <w:rFonts w:cs="Arial"/>
         <w:color w:val="1B505F"/>
-        <w:sz w:val="16"/>
-        <w:szCs w:val="16"/>
+        <w:sz w:val="18"/>
+        <w:szCs w:val="18"/>
       </w:rPr>
       <w:t>1</w:t>
     </w:r>
     <w:r>
       <w:rPr>
-        <w:rFonts w:ascii="Arial" w:hAnsi="Arial" w:cs="Arial"/>
+        <w:rFonts w:cs="Arial"/>
         <w:color w:val="1B505F"/>
-        <w:sz w:val="16"/>
-        <w:szCs w:val="16"/>
+        <w:sz w:val="18"/>
+        <w:szCs w:val="18"/>
       </w:rPr>
       <w:fldChar w:fldCharType="end"/>
     </w:r>
@@ -2724,7 +2724,7 @@
       <w:pStyle w:val="Pidipagina"/>
       <w:jc w:val="center"/>
       <w:rPr>
-        <w:rFonts w:ascii="Arial" w:hAnsi="Arial" w:cs="Arial"/>
+        <w:rFonts w:cs="Arial"/>
         <w:b/>
         <w:bCs/>
         <w:color w:val="1B505F"/>
@@ -2734,7 +2734,7 @@
     </w:pPr>
     <w:r>
       <w:rPr>
-        <w:rFonts w:ascii="Arial" w:hAnsi="Arial" w:cs="Arial"/>
+        <w:rFonts w:cs="Arial"/>
         <w:b/>
         <w:bCs/>
         <w:color w:val="1B505F"/>
@@ -2749,7 +2749,7 @@
       <w:pStyle w:val="Pidipagina"/>
       <w:jc w:val="center"/>
       <w:rPr>
-        <w:rFonts w:ascii="Arial" w:hAnsi="Arial" w:cs="Arial"/>
+        <w:rFonts w:cs="Arial"/>
         <w:color w:val="1B505F"/>
         <w:sz w:val="18"/>
         <w:szCs w:val="18"/>
@@ -2757,21 +2757,111 @@
     </w:pPr>
     <w:r>
       <w:rPr>
-        <w:rFonts w:ascii="Arial" w:hAnsi="Arial" w:cs="Arial"/>
+        <w:rFonts w:cs="Arial"/>
         <w:color w:val="1B505F"/>
         <w:sz w:val="18"/>
         <w:szCs w:val="18"/>
       </w:rPr>
-      <w:t>Viale Belfiore, 55, 50144, Firenze (FI)</w:t>
+      <w:t>Via di Pratignone, 13/4</w:t>
     </w:r>
     <w:r>
       <w:rPr>
-        <w:rFonts w:ascii="Arial" w:hAnsi="Arial" w:cs="Arial"/>
+        <w:rFonts w:cs="Arial"/>
         <w:color w:val="1B505F"/>
         <w:sz w:val="18"/>
         <w:szCs w:val="18"/>
       </w:rPr>
-      <w:t>. Direttore Sanitario: prof. Gian Luigi Taddei.</w:t>
+      <w:t>,</w:t>
+    </w:r>
+    <w:r>
+      <w:rPr>
+        <w:rFonts w:cs="Arial"/>
+        <w:color w:val="1B505F"/>
+        <w:sz w:val="18"/>
+        <w:szCs w:val="18"/>
+      </w:rPr>
+      <w:t xml:space="preserve"> 50019</w:t>
+    </w:r>
+    <w:r>
+      <w:rPr>
+        <w:rFonts w:cs="Arial"/>
+        <w:color w:val="1B505F"/>
+        <w:sz w:val="18"/>
+        <w:szCs w:val="18"/>
+      </w:rPr>
+      <w:t xml:space="preserve"> </w:t>
+    </w:r>
+    <w:r>
+      <w:rPr>
+        <w:rFonts w:cs="Arial"/>
+        <w:color w:val="1B505F"/>
+        <w:sz w:val="18"/>
+        <w:szCs w:val="18"/>
+      </w:rPr>
+      <w:t xml:space="preserve">Sesto Fiorentino </w:t>
+    </w:r>
+    <w:r>
+      <w:rPr>
+        <w:rFonts w:cs="Arial"/>
+        <w:color w:val="1B505F"/>
+        <w:sz w:val="18"/>
+        <w:szCs w:val="18"/>
+      </w:rPr>
+      <w:t>(FI)</w:t>
+    </w:r>
+    <w:r>
+      <w:rPr>
+        <w:rFonts w:cs="Arial"/>
+        <w:color w:val="1B505F"/>
+        <w:sz w:val="18"/>
+        <w:szCs w:val="18"/>
+      </w:rPr>
+      <w:t xml:space="preserve">. </w:t>
+    </w:r>
+    <w:r>
+      <w:rPr>
+        <w:rFonts w:cs="Arial"/>
+        <w:color w:val="1B505F"/>
+        <w:sz w:val="18"/>
+        <w:szCs w:val="18"/>
+      </w:rPr>
+      <w:t xml:space="preserve">Tel. e Fax: </w:t>
+    </w:r>
+    <w:r>
+      <w:rPr>
+        <w:rFonts w:cs="Arial"/>
+        <w:color w:val="1B505F"/>
+        <w:sz w:val="18"/>
+        <w:szCs w:val="18"/>
+      </w:rPr>
+      <w:t>055776511</w:t>
+    </w:r>
+    <w:r>
+      <w:rPr>
+        <w:rFonts w:cs="Arial"/>
+        <w:color w:val="1B505F"/>
+        <w:sz w:val="18"/>
+        <w:szCs w:val="18"/>
+      </w:rPr>
+      <w:t>.</w:t>
+    </w:r>
+    <w:r>
+      <w:rPr>
+        <w:rFonts w:cs="Arial"/>
+        <w:color w:val="1B505F"/>
+        <w:sz w:val="18"/>
+        <w:szCs w:val="18"/>
+      </w:rPr>
+      <w:t xml:space="preserve"> </w:t>
+    </w:r>
+    <w:r>
+      <w:rPr>
+        <w:rFonts w:cs="Arial"/>
+        <w:color w:val="1B505F"/>
+        <w:sz w:val="18"/>
+        <w:szCs w:val="18"/>
+      </w:rPr>
+      <w:t>Direttore Sanitario: prof. Gian Luigi Taddei.</w:t>
     </w:r>
   </w:p>
   <w:p>
@@ -2786,7 +2876,7 @@
     </w:pPr>
     <w:r>
       <w:rPr>
-        <w:rFonts w:ascii="Arial" w:hAnsi="Arial" w:cs="Arial"/>
+        <w:rFonts w:cs="Arial"/>
         <w:color w:val="1B505F"/>
         <w:sz w:val="18"/>
         <w:szCs w:val="18"/>
@@ -2795,7 +2885,7 @@
     </w:r>
     <w:r>
       <w:rPr>
-        <w:rFonts w:ascii="Arial" w:hAnsi="Arial" w:cs="Arial"/>
+        <w:rFonts w:cs="Arial"/>
         <w:color w:val="1B505F"/>
         <w:sz w:val="18"/>
         <w:szCs w:val="18"/>
@@ -2804,7 +2894,7 @@
     </w:r>
     <w:r>
       <w:rPr>
-        <w:rFonts w:ascii="Arial" w:hAnsi="Arial" w:cs="Arial"/>
+        <w:rFonts w:cs="Arial"/>
         <w:color w:val="1B505F"/>
         <w:sz w:val="18"/>
         <w:szCs w:val="18"/>
@@ -2813,7 +2903,7 @@
     </w:r>
     <w:r>
       <w:rPr>
-        <w:rFonts w:ascii="Arial" w:hAnsi="Arial" w:cs="Arial"/>
+        <w:rFonts w:cs="Arial"/>
         <w:color w:val="1B505F"/>
         <w:sz w:val="18"/>
         <w:szCs w:val="18"/>
@@ -2822,7 +2912,7 @@
     </w:r>
     <w:r>
       <w:rPr>
-        <w:rFonts w:ascii="Arial" w:hAnsi="Arial" w:cs="Arial"/>
+        <w:rFonts w:cs="Arial"/>
         <w:color w:val="1B505F"/>
         <w:sz w:val="18"/>
         <w:szCs w:val="18"/>
@@ -2831,12 +2921,50 @@
     </w:r>
     <w:r>
       <w:rPr>
-        <w:rFonts w:ascii="Arial" w:hAnsi="Arial" w:cs="Arial"/>
+        <w:rFonts w:cs="Arial"/>
         <w:color w:val="1B505F"/>
         <w:sz w:val="18"/>
         <w:szCs w:val="18"/>
       </w:rPr>
-      <w:t xml:space="preserve"> – Capitale Sociale: € 10.000,00 i.v.</w:t>
+      <w:t xml:space="preserve"> – Capitale Sociale: € </w:t>
+    </w:r>
+    <w:r>
+      <w:rPr>
+        <w:rFonts w:cs="Arial"/>
+        <w:color w:val="1B505F"/>
+        <w:sz w:val="18"/>
+        <w:szCs w:val="18"/>
+      </w:rPr>
+      <w:t>5</w:t>
+    </w:r>
+    <w:r>
+      <w:rPr>
+        <w:rFonts w:cs="Arial"/>
+        <w:color w:val="1B505F"/>
+        <w:sz w:val="18"/>
+        <w:szCs w:val="18"/>
+      </w:rPr>
+      <w:t xml:space="preserve">0.000,00 </w:t>
+    </w:r>
+    <w:proofErr w:type="spellStart"/>
+    <w:r>
+      <w:rPr>
+        <w:rFonts w:cs="Arial"/>
+        <w:color w:val="1B505F"/>
+        <w:sz w:val="18"/>
+        <w:szCs w:val="18"/>
+      </w:rPr>
+      <w:t>i.v</w:t>
+    </w:r>
+    <w:proofErr w:type="spellEnd"/>
+    <w:r>
+      <w:rPr>
+        <w:rFonts w:cs="Arial"/>
+        <w:color w:val="1B505F"/>
+        <w:sz w:val="18"/>
+        <w:szCs w:val="18"/>
+      </w:rPr>
+      <w:t>.</w:t>
     </w:r>
   </w:p>
 </w:ftr>
@@ -2885,10 +3013,10 @@
       <w:tblLook w:val="0600" w:firstRow="0" w:lastRow="0" w:firstColumn="0" w:lastColumn="0" w:noHBand="1" w:noVBand="1"/>
     </w:tblPr>
     <w:tblGrid>
-      <w:gridCol w:w="5370"/>
+      <w:gridCol w:w="5065"/>
       <w:gridCol w:w="240"/>
       <w:gridCol w:w="2055"/>
-      <w:gridCol w:w="2805"/>
+      <w:gridCol w:w="3110"/>
     </w:tblGrid>
     <w:tr>
       <w:trPr>
@@ -2896,7 +3024,7 @@
       </w:trPr>
       <w:tc>
         <w:tcPr>
-          <w:tcW w:w="5370" w:type="dxa"/>
+          <w:tcW w:w="5065" w:type="dxa"/>
           <w:tcBorders>
             <w:top w:val="nil"/>
             <w:left w:val="nil"/>
@@ -2979,7 +3107,7 @@
         <w:p>
           <w:pPr>
             <w:widowControl w:val="0"/>
-            <w:spacing w:after="0" w:line="240" w:lineRule="auto"/>
+            <w:spacing w:after="0"/>
             <w:rPr>
               <w:rFonts w:ascii="Lato" w:eastAsia="Lato" w:hAnsi="Lato" w:cs="Lato"/>
               <w:color w:val="1A3C47"/>
@@ -3005,7 +3133,7 @@
         <w:p>
           <w:pPr>
             <w:widowControl w:val="0"/>
-            <w:spacing w:after="0" w:line="240" w:lineRule="auto"/>
+            <w:spacing w:after="0"/>
             <w:rPr>
               <w:rFonts w:ascii="Lato" w:eastAsia="Lato" w:hAnsi="Lato" w:cs="Lato"/>
               <w:color w:val="1A3C47"/>
@@ -3020,7 +3148,7 @@
       </w:tc>
       <w:tc>
         <w:tcPr>
-          <w:tcW w:w="2805" w:type="dxa"/>
+          <w:tcW w:w="3110" w:type="dxa"/>
           <w:tcBorders>
             <w:top w:val="nil"/>
             <w:left w:val="nil"/>
@@ -3034,7 +3162,7 @@
             <w:widowControl w:val="0"/>
             <w:spacing w:after="0" w:line="360" w:lineRule="auto"/>
             <w:rPr>
-              <w:rFonts w:ascii="Arial" w:eastAsia="Arial" w:hAnsi="Arial" w:cs="Arial"/>
+              <w:rFonts w:eastAsia="Arial" w:cs="Arial"/>
               <w:color w:val="1A3C47"/>
               <w:kern w:val="0"/>
               <w:sz w:val="8"/>
@@ -3046,13 +3174,13 @@
         </w:p>
         <w:tbl>
           <w:tblPr>
-            <w:tblW w:w="2595" w:type="dxa"/>
+            <w:tblW w:w="2900" w:type="dxa"/>
             <w:tblLayout w:type="fixed"/>
             <w:tblLook w:val="0600" w:firstRow="0" w:lastRow="0" w:firstColumn="0" w:lastColumn="0" w:noHBand="1" w:noVBand="1"/>
           </w:tblPr>
           <w:tblGrid>
             <w:gridCol w:w="300"/>
-            <w:gridCol w:w="2295"/>
+            <w:gridCol w:w="2600"/>
           </w:tblGrid>
           <w:tr>
             <w:trPr>
@@ -3073,12 +3201,11 @@
               <w:p>
                 <w:pPr>
                   <w:framePr w:hSpace="180" w:vSpace="180" w:wrap="around" w:vAnchor="text" w:hAnchor="text" w:xAlign="center"/>
-                  <w:spacing w:after="0" w:line="240" w:lineRule="auto"/>
+                  <w:spacing w:after="0"/>
                   <w:jc w:val="center"/>
                   <w:rPr>
-                    <w:rFonts w:ascii="Arial" w:eastAsia="Arial" w:hAnsi="Arial" w:cs="Arial"/>
+                    <w:rFonts w:eastAsia="Arial" w:cs="Arial"/>
                     <w:kern w:val="0"/>
-                    <w:sz w:val="22"/>
                     <w:szCs w:val="22"/>
                     <w:lang w:val="it" w:eastAsia="it-IT"/>
                     <w14:ligatures w14:val="none"/>
@@ -3086,10 +3213,9 @@
                 </w:pPr>
                 <w:r>
                   <w:rPr>
-                    <w:rFonts w:ascii="Arial" w:eastAsia="Arial" w:hAnsi="Arial" w:cs="Arial"/>
+                    <w:rFonts w:eastAsia="Arial" w:cs="Arial"/>
                     <w:noProof/>
                     <w:kern w:val="0"/>
-                    <w:sz w:val="22"/>
                     <w:szCs w:val="22"/>
                     <w:lang w:val="it" w:eastAsia="it-IT"/>
                     <w14:ligatures w14:val="none"/>
@@ -3134,7 +3260,7 @@
             </w:tc>
             <w:tc>
               <w:tcPr>
-                <w:tcW w:w="2295" w:type="dxa"/>
+                <w:tcW w:w="2600" w:type="dxa"/>
                 <w:tcMar>
                   <w:top w:w="0" w:type="dxa"/>
                   <w:left w:w="0" w:type="dxa"/>
@@ -3146,10 +3272,10 @@
               <w:p>
                 <w:pPr>
                   <w:framePr w:hSpace="180" w:vSpace="180" w:wrap="around" w:vAnchor="text" w:hAnchor="text" w:xAlign="center"/>
-                  <w:spacing w:after="0" w:line="240" w:lineRule="auto"/>
+                  <w:spacing w:after="0"/>
                   <w:jc w:val="center"/>
                   <w:rPr>
-                    <w:rFonts w:ascii="Arial" w:eastAsia="Arial" w:hAnsi="Arial" w:cs="Arial"/>
+                    <w:rFonts w:eastAsia="Arial" w:cs="Arial"/>
                     <w:color w:val="1B505F"/>
                     <w:kern w:val="0"/>
                     <w:sz w:val="18"/>
@@ -3160,7 +3286,7 @@
                 </w:pPr>
                 <w:r>
                   <w:rPr>
-                    <w:rFonts w:ascii="Arial" w:eastAsia="Arial" w:hAnsi="Arial" w:cs="Arial"/>
+                    <w:rFonts w:eastAsia="Arial" w:cs="Arial"/>
                     <w:color w:val="1B505F"/>
                     <w:kern w:val="0"/>
                     <w:sz w:val="18"/>
@@ -3179,7 +3305,7 @@
             </w:trPr>
             <w:tc>
               <w:tcPr>
-                <w:tcW w:w="2595" w:type="dxa"/>
+                <w:tcW w:w="2900" w:type="dxa"/>
                 <w:gridSpan w:val="2"/>
                 <w:tcMar>
                   <w:top w:w="0" w:type="dxa"/>
@@ -3192,9 +3318,9 @@
               <w:p>
                 <w:pPr>
                   <w:framePr w:hSpace="180" w:vSpace="180" w:wrap="around" w:vAnchor="text" w:hAnchor="text" w:xAlign="center"/>
-                  <w:spacing w:after="0" w:line="240" w:lineRule="auto"/>
+                  <w:spacing w:after="0"/>
                   <w:rPr>
-                    <w:rFonts w:ascii="Arial" w:eastAsia="Arial" w:hAnsi="Arial" w:cs="Arial"/>
+                    <w:rFonts w:eastAsia="Arial" w:cs="Arial"/>
                     <w:kern w:val="0"/>
                     <w:sz w:val="4"/>
                     <w:szCs w:val="4"/>
@@ -3224,12 +3350,11 @@
               <w:p>
                 <w:pPr>
                   <w:framePr w:hSpace="180" w:vSpace="180" w:wrap="around" w:vAnchor="text" w:hAnchor="text" w:xAlign="center"/>
-                  <w:spacing w:after="0" w:line="240" w:lineRule="auto"/>
+                  <w:spacing w:after="0"/>
                   <w:jc w:val="center"/>
                   <w:rPr>
-                    <w:rFonts w:ascii="Arial" w:eastAsia="Arial" w:hAnsi="Arial" w:cs="Arial"/>
+                    <w:rFonts w:eastAsia="Arial" w:cs="Arial"/>
                     <w:kern w:val="0"/>
-                    <w:sz w:val="22"/>
                     <w:szCs w:val="22"/>
                     <w:lang w:val="it" w:eastAsia="it-IT"/>
                     <w14:ligatures w14:val="none"/>
@@ -3237,10 +3362,9 @@
                 </w:pPr>
                 <w:r>
                   <w:rPr>
-                    <w:rFonts w:ascii="Arial" w:eastAsia="Arial" w:hAnsi="Arial" w:cs="Arial"/>
+                    <w:rFonts w:eastAsia="Arial" w:cs="Arial"/>
                     <w:noProof/>
                     <w:kern w:val="0"/>
-                    <w:sz w:val="22"/>
                     <w:szCs w:val="22"/>
                     <w:lang w:val="it" w:eastAsia="it-IT"/>
                     <w14:ligatures w14:val="none"/>
@@ -3285,7 +3409,7 @@
             </w:tc>
             <w:tc>
               <w:tcPr>
-                <w:tcW w:w="2295" w:type="dxa"/>
+                <w:tcW w:w="2600" w:type="dxa"/>
                 <w:tcMar>
                   <w:top w:w="0" w:type="dxa"/>
                   <w:left w:w="0" w:type="dxa"/>
@@ -3297,10 +3421,10 @@
               <w:p>
                 <w:pPr>
                   <w:framePr w:hSpace="180" w:vSpace="180" w:wrap="around" w:vAnchor="text" w:hAnchor="text" w:xAlign="center"/>
-                  <w:spacing w:after="0" w:line="240" w:lineRule="auto"/>
+                  <w:spacing w:after="0"/>
                   <w:jc w:val="center"/>
                   <w:rPr>
-                    <w:rFonts w:ascii="Arial" w:eastAsia="Arial" w:hAnsi="Arial" w:cs="Arial"/>
+                    <w:rFonts w:eastAsia="Arial" w:cs="Arial"/>
                     <w:color w:val="1B505F"/>
                     <w:kern w:val="0"/>
                     <w:sz w:val="18"/>
@@ -3311,7 +3435,7 @@
                 </w:pPr>
                 <w:r>
                   <w:rPr>
-                    <w:rFonts w:ascii="Arial" w:eastAsia="Arial" w:hAnsi="Arial" w:cs="Arial"/>
+                    <w:rFonts w:eastAsia="Arial" w:cs="Arial"/>
                     <w:color w:val="1B505F"/>
                     <w:kern w:val="0"/>
                     <w:sz w:val="18"/>
@@ -3330,7 +3454,7 @@
             </w:trPr>
             <w:tc>
               <w:tcPr>
-                <w:tcW w:w="2595" w:type="dxa"/>
+                <w:tcW w:w="2900" w:type="dxa"/>
                 <w:gridSpan w:val="2"/>
                 <w:tcMar>
                   <w:top w:w="0" w:type="dxa"/>
@@ -3343,9 +3467,9 @@
               <w:p>
                 <w:pPr>
                   <w:framePr w:hSpace="180" w:vSpace="180" w:wrap="around" w:vAnchor="text" w:hAnchor="text" w:xAlign="center"/>
-                  <w:spacing w:after="0" w:line="240" w:lineRule="auto"/>
+                  <w:spacing w:after="0"/>
                   <w:rPr>
-                    <w:rFonts w:ascii="Arial" w:eastAsia="Arial" w:hAnsi="Arial" w:cs="Arial"/>
+                    <w:rFonts w:eastAsia="Arial" w:cs="Arial"/>
                     <w:kern w:val="0"/>
                     <w:sz w:val="4"/>
                     <w:szCs w:val="4"/>
@@ -3375,12 +3499,11 @@
               <w:p>
                 <w:pPr>
                   <w:framePr w:hSpace="180" w:vSpace="180" w:wrap="around" w:vAnchor="text" w:hAnchor="text" w:xAlign="center"/>
-                  <w:spacing w:after="0" w:line="240" w:lineRule="auto"/>
+                  <w:spacing w:after="0"/>
                   <w:jc w:val="center"/>
                   <w:rPr>
-                    <w:rFonts w:ascii="Arial" w:eastAsia="Arial" w:hAnsi="Arial" w:cs="Arial"/>
+                    <w:rFonts w:eastAsia="Arial" w:cs="Arial"/>
                     <w:kern w:val="0"/>
-                    <w:sz w:val="22"/>
                     <w:szCs w:val="22"/>
                     <w:lang w:val="it" w:eastAsia="it-IT"/>
                     <w14:ligatures w14:val="none"/>
@@ -3388,10 +3511,9 @@
                 </w:pPr>
                 <w:r>
                   <w:rPr>
-                    <w:rFonts w:ascii="Arial" w:eastAsia="Arial" w:hAnsi="Arial" w:cs="Arial"/>
+                    <w:rFonts w:eastAsia="Arial" w:cs="Arial"/>
                     <w:noProof/>
                     <w:kern w:val="0"/>
-                    <w:sz w:val="22"/>
                     <w:szCs w:val="22"/>
                     <w:lang w:val="it" w:eastAsia="it-IT"/>
                     <w14:ligatures w14:val="none"/>
@@ -3436,7 +3558,7 @@
             </w:tc>
             <w:tc>
               <w:tcPr>
-                <w:tcW w:w="2295" w:type="dxa"/>
+                <w:tcW w:w="2600" w:type="dxa"/>
                 <w:tcMar>
                   <w:top w:w="0" w:type="dxa"/>
                   <w:left w:w="0" w:type="dxa"/>
@@ -3448,10 +3570,10 @@
               <w:p>
                 <w:pPr>
                   <w:framePr w:hSpace="180" w:vSpace="180" w:wrap="around" w:vAnchor="text" w:hAnchor="text" w:xAlign="center"/>
-                  <w:spacing w:after="0" w:line="240" w:lineRule="auto"/>
+                  <w:spacing w:after="0"/>
                   <w:jc w:val="center"/>
                   <w:rPr>
-                    <w:rFonts w:ascii="Arial" w:eastAsia="Arial" w:hAnsi="Arial" w:cs="Arial"/>
+                    <w:rFonts w:eastAsia="Arial" w:cs="Arial"/>
                     <w:color w:val="1B505F"/>
                     <w:kern w:val="0"/>
                     <w:sz w:val="18"/>
@@ -3462,7 +3584,7 @@
                 </w:pPr>
                 <w:r>
                   <w:rPr>
-                    <w:rFonts w:ascii="Arial" w:eastAsia="Arial" w:hAnsi="Arial" w:cs="Arial"/>
+                    <w:rFonts w:eastAsia="Arial" w:cs="Arial"/>
                     <w:color w:val="1B505F"/>
                     <w:kern w:val="0"/>
                     <w:sz w:val="18"/>
@@ -3481,7 +3603,7 @@
             <w:widowControl w:val="0"/>
             <w:spacing w:after="0" w:line="360" w:lineRule="auto"/>
             <w:rPr>
-              <w:rFonts w:ascii="Arial" w:eastAsia="Arial" w:hAnsi="Arial" w:cs="Arial"/>
+              <w:rFonts w:eastAsia="Arial" w:cs="Arial"/>
               <w:color w:val="1A3C47"/>
               <w:kern w:val="0"/>
               <w:sz w:val="18"/>

</xml_diff>